<commit_message>
mathematical excel functions complete
</commit_message>
<xml_diff>
--- a/Excel/1st_8th_june.docx
+++ b/Excel/1st_8th_june.docx
@@ -387,6 +387,7 @@
       </w:pPr>
       <w:r>
         <w:rPr>
+          <w:noProof/>
           <w:sz w:val="24"/>
           <w:szCs w:val="24"/>
           <w:lang w:val="en-US"/>
@@ -440,8 +441,8 @@
         <w:rPr>
           <w:b/>
           <w:bCs/>
-          <w:sz w:val="32"/>
-          <w:szCs w:val="32"/>
+          <w:sz w:val="36"/>
+          <w:szCs w:val="36"/>
           <w:lang w:val="en-US"/>
         </w:rPr>
       </w:pPr>
@@ -449,11 +450,41 @@
         <w:rPr>
           <w:b/>
           <w:bCs/>
-          <w:sz w:val="32"/>
-          <w:szCs w:val="32"/>
-          <w:lang w:val="en-US"/>
-        </w:rPr>
-        <w:t>** Functions</w:t>
+          <w:sz w:val="36"/>
+          <w:szCs w:val="36"/>
+          <w:lang w:val="en-US"/>
+        </w:rPr>
+        <w:t xml:space="preserve">** </w:t>
+      </w:r>
+      <w:r>
+        <w:rPr>
+          <w:b/>
+          <w:bCs/>
+          <w:sz w:val="36"/>
+          <w:szCs w:val="36"/>
+          <w:lang w:val="en-US"/>
+        </w:rPr>
+        <w:t xml:space="preserve">Mathematical </w:t>
+      </w:r>
+      <w:r>
+        <w:rPr>
+          <w:b/>
+          <w:bCs/>
+          <w:sz w:val="36"/>
+          <w:szCs w:val="36"/>
+          <w:lang w:val="en-US"/>
+        </w:rPr>
+        <w:t>Functions</w:t>
+      </w:r>
+      <w:r>
+        <w:rPr>
+          <w:b/>
+          <w:bCs/>
+          <w:sz w:val="36"/>
+          <w:szCs w:val="36"/>
+          <w:lang w:val="en-US"/>
+        </w:rPr>
+        <w:t xml:space="preserve"> **</w:t>
       </w:r>
     </w:p>
     <w:p>
@@ -556,6 +587,8 @@
         <w:tab/>
         <w:t xml:space="preserve">:  output will be 8 </w:t>
       </w:r>
+      <w:bookmarkStart w:id="0" w:name="_GoBack"/>
+      <w:bookmarkEnd w:id="0"/>
     </w:p>
     <w:p>
       <w:pPr>
@@ -1044,266 +1077,6 @@
     <w:p>
       <w:pPr>
         <w:pStyle w:val="ListParagraph"/>
-        <w:numPr>
-          <w:ilvl w:val="0"/>
-          <w:numId w:val="2"/>
-        </w:numPr>
-        <w:rPr>
-          <w:sz w:val="24"/>
-          <w:szCs w:val="24"/>
-          <w:lang w:val="en-US"/>
-        </w:rPr>
-      </w:pPr>
-      <w:proofErr w:type="gramStart"/>
-      <w:r>
-        <w:rPr>
-          <w:sz w:val="24"/>
-          <w:szCs w:val="24"/>
-          <w:lang w:val="en-US"/>
-        </w:rPr>
-        <w:t>SUM</w:t>
-      </w:r>
-      <w:r>
-        <w:rPr>
-          <w:sz w:val="24"/>
-          <w:szCs w:val="24"/>
-          <w:lang w:val="en-US"/>
-        </w:rPr>
-        <w:t>(</w:t>
-      </w:r>
-      <w:proofErr w:type="gramEnd"/>
-      <w:r>
-        <w:rPr>
-          <w:sz w:val="24"/>
-          <w:szCs w:val="24"/>
-          <w:lang w:val="en-US"/>
-        </w:rPr>
-        <w:t>range</w:t>
-      </w:r>
-      <w:r>
-        <w:rPr>
-          <w:sz w:val="24"/>
-          <w:szCs w:val="24"/>
-          <w:lang w:val="en-US"/>
-        </w:rPr>
-        <w:t>)</w:t>
-      </w:r>
-      <w:r>
-        <w:rPr>
-          <w:sz w:val="24"/>
-          <w:szCs w:val="24"/>
-          <w:lang w:val="en-US"/>
-        </w:rPr>
-        <w:tab/>
-      </w:r>
-      <w:r>
-        <w:rPr>
-          <w:sz w:val="24"/>
-          <w:szCs w:val="24"/>
-          <w:lang w:val="en-US"/>
-        </w:rPr>
-        <w:tab/>
-      </w:r>
-      <w:r>
-        <w:rPr>
-          <w:sz w:val="24"/>
-          <w:szCs w:val="24"/>
-          <w:lang w:val="en-US"/>
-        </w:rPr>
-        <w:sym w:font="Wingdings" w:char="F0E0"/>
-      </w:r>
-      <w:r>
-        <w:rPr>
-          <w:sz w:val="24"/>
-          <w:szCs w:val="24"/>
-          <w:lang w:val="en-US"/>
-        </w:rPr>
-        <w:t xml:space="preserve"> return </w:t>
-      </w:r>
-      <w:r>
-        <w:rPr>
-          <w:sz w:val="24"/>
-          <w:szCs w:val="24"/>
-          <w:lang w:val="en-US"/>
-        </w:rPr>
-        <w:t>a sum of multiples values</w:t>
-      </w:r>
-      <w:r>
-        <w:rPr>
-          <w:sz w:val="24"/>
-          <w:szCs w:val="24"/>
-          <w:lang w:val="en-US"/>
-        </w:rPr>
-        <w:t xml:space="preserve"> </w:t>
-      </w:r>
-    </w:p>
-    <w:p>
-      <w:pPr>
-        <w:ind w:left="720" w:firstLine="720"/>
-        <w:rPr>
-          <w:sz w:val="24"/>
-          <w:szCs w:val="24"/>
-          <w:lang w:val="en-US"/>
-        </w:rPr>
-      </w:pPr>
-      <w:r>
-        <w:rPr>
-          <w:sz w:val="24"/>
-          <w:szCs w:val="24"/>
-          <w:lang w:val="en-US"/>
-        </w:rPr>
-        <w:t xml:space="preserve">e.g. = </w:t>
-      </w:r>
-      <w:proofErr w:type="gramStart"/>
-      <w:r>
-        <w:rPr>
-          <w:sz w:val="24"/>
-          <w:szCs w:val="24"/>
-          <w:lang w:val="en-US"/>
-        </w:rPr>
-        <w:t>SUM(</w:t>
-      </w:r>
-      <w:proofErr w:type="gramEnd"/>
-      <w:r>
-        <w:rPr>
-          <w:sz w:val="24"/>
-          <w:szCs w:val="24"/>
-          <w:lang w:val="en-US"/>
-        </w:rPr>
-        <w:t xml:space="preserve">10,20,30) </w:t>
-      </w:r>
-      <w:r>
-        <w:rPr>
-          <w:sz w:val="24"/>
-          <w:szCs w:val="24"/>
-          <w:lang w:val="en-US"/>
-        </w:rPr>
-        <w:tab/>
-        <w:t>: output will be 60</w:t>
-      </w:r>
-      <w:r>
-        <w:rPr>
-          <w:sz w:val="24"/>
-          <w:szCs w:val="24"/>
-          <w:lang w:val="en-US"/>
-        </w:rPr>
-        <w:tab/>
-      </w:r>
-      <w:r>
-        <w:rPr>
-          <w:sz w:val="24"/>
-          <w:szCs w:val="24"/>
-          <w:lang w:val="en-US"/>
-        </w:rPr>
-        <w:tab/>
-      </w:r>
-      <w:r>
-        <w:rPr>
-          <w:sz w:val="24"/>
-          <w:szCs w:val="24"/>
-          <w:lang w:val="en-US"/>
-        </w:rPr>
-        <w:sym w:font="Wingdings" w:char="F0E0"/>
-      </w:r>
-      <w:r>
-        <w:rPr>
-          <w:sz w:val="24"/>
-          <w:szCs w:val="24"/>
-          <w:lang w:val="en-US"/>
-        </w:rPr>
-        <w:t xml:space="preserve"> =sum(n1,n2,n3…n)</w:t>
-      </w:r>
-    </w:p>
-    <w:p>
-      <w:pPr>
-        <w:rPr>
-          <w:sz w:val="24"/>
-          <w:szCs w:val="24"/>
-          <w:lang w:val="en-US"/>
-        </w:rPr>
-      </w:pPr>
-      <w:r>
-        <w:rPr>
-          <w:sz w:val="24"/>
-          <w:szCs w:val="24"/>
-          <w:lang w:val="en-US"/>
-        </w:rPr>
-        <w:t xml:space="preserve">   </w:t>
-      </w:r>
-      <w:r>
-        <w:rPr>
-          <w:sz w:val="24"/>
-          <w:szCs w:val="24"/>
-          <w:lang w:val="en-US"/>
-        </w:rPr>
-        <w:tab/>
-      </w:r>
-      <w:r>
-        <w:rPr>
-          <w:sz w:val="24"/>
-          <w:szCs w:val="24"/>
-          <w:lang w:val="en-US"/>
-        </w:rPr>
-        <w:tab/>
-        <w:t xml:space="preserve">        =SUM(b</w:t>
-      </w:r>
-      <w:proofErr w:type="gramStart"/>
-      <w:r>
-        <w:rPr>
-          <w:sz w:val="24"/>
-          <w:szCs w:val="24"/>
-          <w:lang w:val="en-US"/>
-        </w:rPr>
-        <w:t>12:b</w:t>
-      </w:r>
-      <w:proofErr w:type="gramEnd"/>
-      <w:r>
-        <w:rPr>
-          <w:sz w:val="24"/>
-          <w:szCs w:val="24"/>
-          <w:lang w:val="en-US"/>
-        </w:rPr>
-        <w:t>15)  : give sum this range cells</w:t>
-      </w:r>
-      <w:r>
-        <w:rPr>
-          <w:sz w:val="24"/>
-          <w:szCs w:val="24"/>
-          <w:lang w:val="en-US"/>
-        </w:rPr>
-        <w:tab/>
-      </w:r>
-      <w:r>
-        <w:rPr>
-          <w:sz w:val="24"/>
-          <w:szCs w:val="24"/>
-          <w:lang w:val="en-US"/>
-        </w:rPr>
-        <w:sym w:font="Wingdings" w:char="F0E0"/>
-      </w:r>
-      <w:r>
-        <w:rPr>
-          <w:sz w:val="24"/>
-          <w:szCs w:val="24"/>
-          <w:lang w:val="en-US"/>
-        </w:rPr>
-        <w:t xml:space="preserve"> =sum(range)</w:t>
-      </w:r>
-    </w:p>
-    <w:p>
-      <w:pPr>
-        <w:pStyle w:val="ListParagraph"/>
-        <w:ind w:left="1440"/>
-        <w:rPr>
-          <w:sz w:val="24"/>
-          <w:szCs w:val="24"/>
-          <w:lang w:val="en-US"/>
-        </w:rPr>
-      </w:pPr>
-    </w:p>
-    <w:p>
-      <w:pPr>
-        <w:pStyle w:val="ListParagraph"/>
         <w:ind w:left="1440"/>
         <w:rPr>
           <w:sz w:val="24"/>
@@ -1325,6 +1098,245 @@
           <w:lang w:val="en-US"/>
         </w:rPr>
       </w:pPr>
+      <w:proofErr w:type="gramStart"/>
+      <w:r>
+        <w:rPr>
+          <w:sz w:val="24"/>
+          <w:szCs w:val="24"/>
+          <w:lang w:val="en-US"/>
+        </w:rPr>
+        <w:t>SUM(</w:t>
+      </w:r>
+      <w:proofErr w:type="gramEnd"/>
+      <w:r>
+        <w:rPr>
+          <w:sz w:val="24"/>
+          <w:szCs w:val="24"/>
+          <w:lang w:val="en-US"/>
+        </w:rPr>
+        <w:t>range)</w:t>
+      </w:r>
+      <w:r>
+        <w:rPr>
+          <w:sz w:val="24"/>
+          <w:szCs w:val="24"/>
+          <w:lang w:val="en-US"/>
+        </w:rPr>
+        <w:tab/>
+      </w:r>
+      <w:r>
+        <w:rPr>
+          <w:sz w:val="24"/>
+          <w:szCs w:val="24"/>
+          <w:lang w:val="en-US"/>
+        </w:rPr>
+        <w:tab/>
+      </w:r>
+      <w:r>
+        <w:rPr>
+          <w:sz w:val="24"/>
+          <w:szCs w:val="24"/>
+          <w:lang w:val="en-US"/>
+        </w:rPr>
+        <w:sym w:font="Wingdings" w:char="F0E0"/>
+      </w:r>
+      <w:r>
+        <w:rPr>
+          <w:sz w:val="24"/>
+          <w:szCs w:val="24"/>
+          <w:lang w:val="en-US"/>
+        </w:rPr>
+        <w:t xml:space="preserve"> return a sum of multiples values </w:t>
+      </w:r>
+    </w:p>
+    <w:p>
+      <w:pPr>
+        <w:ind w:left="720" w:firstLine="720"/>
+        <w:rPr>
+          <w:sz w:val="24"/>
+          <w:szCs w:val="24"/>
+          <w:lang w:val="en-US"/>
+        </w:rPr>
+      </w:pPr>
+      <w:r>
+        <w:rPr>
+          <w:sz w:val="24"/>
+          <w:szCs w:val="24"/>
+          <w:lang w:val="en-US"/>
+        </w:rPr>
+        <w:t xml:space="preserve">e.g. = </w:t>
+      </w:r>
+      <w:proofErr w:type="gramStart"/>
+      <w:r>
+        <w:rPr>
+          <w:sz w:val="24"/>
+          <w:szCs w:val="24"/>
+          <w:lang w:val="en-US"/>
+        </w:rPr>
+        <w:t>SUM(</w:t>
+      </w:r>
+      <w:proofErr w:type="gramEnd"/>
+      <w:r>
+        <w:rPr>
+          <w:sz w:val="24"/>
+          <w:szCs w:val="24"/>
+          <w:lang w:val="en-US"/>
+        </w:rPr>
+        <w:t xml:space="preserve">10,20,30) </w:t>
+      </w:r>
+      <w:r>
+        <w:rPr>
+          <w:sz w:val="24"/>
+          <w:szCs w:val="24"/>
+          <w:lang w:val="en-US"/>
+        </w:rPr>
+        <w:tab/>
+        <w:t>: output will be 60</w:t>
+      </w:r>
+      <w:r>
+        <w:rPr>
+          <w:sz w:val="24"/>
+          <w:szCs w:val="24"/>
+          <w:lang w:val="en-US"/>
+        </w:rPr>
+        <w:tab/>
+      </w:r>
+      <w:r>
+        <w:rPr>
+          <w:sz w:val="24"/>
+          <w:szCs w:val="24"/>
+          <w:lang w:val="en-US"/>
+        </w:rPr>
+        <w:tab/>
+      </w:r>
+      <w:r>
+        <w:rPr>
+          <w:sz w:val="24"/>
+          <w:szCs w:val="24"/>
+          <w:lang w:val="en-US"/>
+        </w:rPr>
+        <w:sym w:font="Wingdings" w:char="F0E0"/>
+      </w:r>
+      <w:r>
+        <w:rPr>
+          <w:sz w:val="24"/>
+          <w:szCs w:val="24"/>
+          <w:lang w:val="en-US"/>
+        </w:rPr>
+        <w:t xml:space="preserve"> =sum(n1,n2,n3…n)</w:t>
+      </w:r>
+    </w:p>
+    <w:p>
+      <w:pPr>
+        <w:rPr>
+          <w:sz w:val="24"/>
+          <w:szCs w:val="24"/>
+          <w:lang w:val="en-US"/>
+        </w:rPr>
+      </w:pPr>
+      <w:r>
+        <w:rPr>
+          <w:sz w:val="24"/>
+          <w:szCs w:val="24"/>
+          <w:lang w:val="en-US"/>
+        </w:rPr>
+        <w:t xml:space="preserve">   </w:t>
+      </w:r>
+      <w:r>
+        <w:rPr>
+          <w:sz w:val="24"/>
+          <w:szCs w:val="24"/>
+          <w:lang w:val="en-US"/>
+        </w:rPr>
+        <w:tab/>
+      </w:r>
+      <w:r>
+        <w:rPr>
+          <w:sz w:val="24"/>
+          <w:szCs w:val="24"/>
+          <w:lang w:val="en-US"/>
+        </w:rPr>
+        <w:tab/>
+        <w:t xml:space="preserve">        =SUM(b</w:t>
+      </w:r>
+      <w:proofErr w:type="gramStart"/>
+      <w:r>
+        <w:rPr>
+          <w:sz w:val="24"/>
+          <w:szCs w:val="24"/>
+          <w:lang w:val="en-US"/>
+        </w:rPr>
+        <w:t>12:b</w:t>
+      </w:r>
+      <w:proofErr w:type="gramEnd"/>
+      <w:r>
+        <w:rPr>
+          <w:sz w:val="24"/>
+          <w:szCs w:val="24"/>
+          <w:lang w:val="en-US"/>
+        </w:rPr>
+        <w:t>15)  : give sum this range cells</w:t>
+      </w:r>
+      <w:r>
+        <w:rPr>
+          <w:sz w:val="24"/>
+          <w:szCs w:val="24"/>
+          <w:lang w:val="en-US"/>
+        </w:rPr>
+        <w:tab/>
+      </w:r>
+      <w:r>
+        <w:rPr>
+          <w:sz w:val="24"/>
+          <w:szCs w:val="24"/>
+          <w:lang w:val="en-US"/>
+        </w:rPr>
+        <w:sym w:font="Wingdings" w:char="F0E0"/>
+      </w:r>
+      <w:r>
+        <w:rPr>
+          <w:sz w:val="24"/>
+          <w:szCs w:val="24"/>
+          <w:lang w:val="en-US"/>
+        </w:rPr>
+        <w:t xml:space="preserve"> =sum(range)</w:t>
+      </w:r>
+    </w:p>
+    <w:p>
+      <w:pPr>
+        <w:pStyle w:val="ListParagraph"/>
+        <w:ind w:left="1440"/>
+        <w:rPr>
+          <w:sz w:val="24"/>
+          <w:szCs w:val="24"/>
+          <w:lang w:val="en-US"/>
+        </w:rPr>
+      </w:pPr>
+    </w:p>
+    <w:p>
+      <w:pPr>
+        <w:pStyle w:val="ListParagraph"/>
+        <w:ind w:left="1440"/>
+        <w:rPr>
+          <w:sz w:val="24"/>
+          <w:szCs w:val="24"/>
+          <w:lang w:val="en-US"/>
+        </w:rPr>
+      </w:pPr>
+    </w:p>
+    <w:p>
+      <w:pPr>
+        <w:pStyle w:val="ListParagraph"/>
+        <w:numPr>
+          <w:ilvl w:val="0"/>
+          <w:numId w:val="2"/>
+        </w:numPr>
+        <w:rPr>
+          <w:sz w:val="24"/>
+          <w:szCs w:val="24"/>
+          <w:lang w:val="en-US"/>
+        </w:rPr>
+      </w:pPr>
       <w:r>
         <w:rPr>
           <w:sz w:val="24"/>
@@ -1441,17 +1453,7 @@
           <w:szCs w:val="24"/>
           <w:lang w:val="en-US"/>
         </w:rPr>
-        <w:t>range</w:t>
-      </w:r>
-      <w:bookmarkStart w:id="0" w:name="_GoBack"/>
-      <w:bookmarkEnd w:id="0"/>
-      <w:r>
-        <w:rPr>
-          <w:sz w:val="24"/>
-          <w:szCs w:val="24"/>
-          <w:lang w:val="en-US"/>
-        </w:rPr>
-        <w:t xml:space="preserve">  </w:t>
+        <w:t xml:space="preserve">range  </w:t>
       </w:r>
       <w:r>
         <w:rPr>
@@ -1579,6 +1581,7 @@
       </w:pPr>
       <w:r>
         <w:rPr>
+          <w:noProof/>
           <w:sz w:val="24"/>
           <w:szCs w:val="24"/>
           <w:lang w:val="en-US"/>
@@ -1620,6 +1623,1114 @@
         </w:drawing>
       </w:r>
     </w:p>
+    <w:p>
+      <w:pPr>
+        <w:tabs>
+          <w:tab w:val="left" w:pos="2980"/>
+        </w:tabs>
+        <w:rPr>
+          <w:sz w:val="24"/>
+          <w:szCs w:val="24"/>
+          <w:lang w:val="en-US"/>
+        </w:rPr>
+      </w:pPr>
+    </w:p>
+    <w:p>
+      <w:pPr>
+        <w:tabs>
+          <w:tab w:val="left" w:pos="2980"/>
+        </w:tabs>
+        <w:rPr>
+          <w:sz w:val="24"/>
+          <w:szCs w:val="24"/>
+          <w:lang w:val="en-US"/>
+        </w:rPr>
+      </w:pPr>
+    </w:p>
+    <w:p>
+      <w:pPr>
+        <w:tabs>
+          <w:tab w:val="left" w:pos="2980"/>
+        </w:tabs>
+        <w:rPr>
+          <w:sz w:val="24"/>
+          <w:szCs w:val="24"/>
+          <w:lang w:val="en-US"/>
+        </w:rPr>
+      </w:pPr>
+    </w:p>
+    <w:p>
+      <w:pPr>
+        <w:tabs>
+          <w:tab w:val="left" w:pos="2980"/>
+        </w:tabs>
+        <w:rPr>
+          <w:sz w:val="24"/>
+          <w:szCs w:val="24"/>
+          <w:lang w:val="en-US"/>
+        </w:rPr>
+      </w:pPr>
+    </w:p>
+    <w:p>
+      <w:pPr>
+        <w:pStyle w:val="ListParagraph"/>
+        <w:numPr>
+          <w:ilvl w:val="0"/>
+          <w:numId w:val="2"/>
+        </w:numPr>
+        <w:rPr>
+          <w:sz w:val="24"/>
+          <w:szCs w:val="24"/>
+          <w:lang w:val="en-US"/>
+        </w:rPr>
+      </w:pPr>
+      <w:proofErr w:type="gramStart"/>
+      <w:r>
+        <w:rPr>
+          <w:sz w:val="24"/>
+          <w:szCs w:val="24"/>
+          <w:lang w:val="en-US"/>
+        </w:rPr>
+        <w:lastRenderedPageBreak/>
+        <w:t>SUMIF</w:t>
+      </w:r>
+      <w:r>
+        <w:rPr>
+          <w:sz w:val="24"/>
+          <w:szCs w:val="24"/>
+          <w:lang w:val="en-US"/>
+        </w:rPr>
+        <w:t>S</w:t>
+      </w:r>
+      <w:r>
+        <w:rPr>
+          <w:sz w:val="24"/>
+          <w:szCs w:val="24"/>
+          <w:lang w:val="en-US"/>
+        </w:rPr>
+        <w:t>(</w:t>
+      </w:r>
+      <w:proofErr w:type="gramEnd"/>
+      <w:r>
+        <w:rPr>
+          <w:sz w:val="24"/>
+          <w:szCs w:val="24"/>
+          <w:lang w:val="en-US"/>
+        </w:rPr>
+        <w:t>sum_</w:t>
+      </w:r>
+      <w:r>
+        <w:rPr>
+          <w:sz w:val="24"/>
+          <w:szCs w:val="24"/>
+          <w:lang w:val="en-US"/>
+        </w:rPr>
+        <w:t>range, criteria</w:t>
+      </w:r>
+      <w:r>
+        <w:rPr>
+          <w:sz w:val="24"/>
+          <w:szCs w:val="24"/>
+          <w:lang w:val="en-US"/>
+        </w:rPr>
+        <w:t>_range1</w:t>
+      </w:r>
+      <w:r>
+        <w:rPr>
+          <w:sz w:val="24"/>
+          <w:szCs w:val="24"/>
+          <w:lang w:val="en-US"/>
+        </w:rPr>
+        <w:t>,</w:t>
+      </w:r>
+      <w:r>
+        <w:rPr>
+          <w:sz w:val="24"/>
+          <w:szCs w:val="24"/>
+          <w:lang w:val="en-US"/>
+        </w:rPr>
+        <w:t xml:space="preserve"> criteria1, </w:t>
+      </w:r>
+      <w:r>
+        <w:rPr>
+          <w:sz w:val="24"/>
+          <w:szCs w:val="24"/>
+          <w:lang w:val="en-US"/>
+        </w:rPr>
+        <w:t>criteria</w:t>
+      </w:r>
+      <w:r>
+        <w:rPr>
+          <w:sz w:val="24"/>
+          <w:szCs w:val="24"/>
+          <w:lang w:val="en-US"/>
+        </w:rPr>
+        <w:t>_range2, criteria2, ….</w:t>
+      </w:r>
+      <w:r>
+        <w:rPr>
+          <w:sz w:val="24"/>
+          <w:szCs w:val="24"/>
+          <w:lang w:val="en-US"/>
+        </w:rPr>
+        <w:t>)</w:t>
+      </w:r>
+      <w:r>
+        <w:rPr>
+          <w:sz w:val="24"/>
+          <w:szCs w:val="24"/>
+          <w:lang w:val="en-US"/>
+        </w:rPr>
+        <w:tab/>
+        <w:t xml:space="preserve">      </w:t>
+      </w:r>
+      <w:r>
+        <w:rPr>
+          <w:lang w:val="en-US"/>
+        </w:rPr>
+        <w:sym w:font="Wingdings" w:char="F0E0"/>
+      </w:r>
+      <w:r>
+        <w:rPr>
+          <w:sz w:val="24"/>
+          <w:szCs w:val="24"/>
+          <w:lang w:val="en-US"/>
+        </w:rPr>
+        <w:t xml:space="preserve"> used to add values based on </w:t>
+      </w:r>
+      <w:r>
+        <w:rPr>
+          <w:sz w:val="24"/>
+          <w:szCs w:val="24"/>
+          <w:lang w:val="en-US"/>
+        </w:rPr>
+        <w:t xml:space="preserve">multiple </w:t>
+      </w:r>
+      <w:r>
+        <w:rPr>
+          <w:sz w:val="24"/>
+          <w:szCs w:val="24"/>
+          <w:lang w:val="en-US"/>
+        </w:rPr>
+        <w:t>condition</w:t>
+      </w:r>
+      <w:r>
+        <w:rPr>
+          <w:sz w:val="24"/>
+          <w:szCs w:val="24"/>
+          <w:lang w:val="en-US"/>
+        </w:rPr>
+        <w:t>s</w:t>
+      </w:r>
+      <w:r>
+        <w:rPr>
+          <w:sz w:val="24"/>
+          <w:szCs w:val="24"/>
+          <w:lang w:val="en-US"/>
+        </w:rPr>
+        <w:t>.</w:t>
+      </w:r>
+    </w:p>
+    <w:p>
+      <w:pPr>
+        <w:pStyle w:val="ListParagraph"/>
+        <w:numPr>
+          <w:ilvl w:val="2"/>
+          <w:numId w:val="2"/>
+        </w:numPr>
+        <w:rPr>
+          <w:sz w:val="24"/>
+          <w:szCs w:val="24"/>
+          <w:lang w:val="en-US"/>
+        </w:rPr>
+      </w:pPr>
+      <w:r>
+        <w:rPr>
+          <w:sz w:val="24"/>
+          <w:szCs w:val="24"/>
+          <w:lang w:val="en-US"/>
+        </w:rPr>
+        <w:t>sum_</w:t>
+      </w:r>
+      <w:r>
+        <w:rPr>
+          <w:sz w:val="24"/>
+          <w:szCs w:val="24"/>
+          <w:lang w:val="en-US"/>
+        </w:rPr>
+        <w:t>range</w:t>
+      </w:r>
+      <w:r>
+        <w:rPr>
+          <w:sz w:val="24"/>
+          <w:szCs w:val="24"/>
+          <w:lang w:val="en-US"/>
+        </w:rPr>
+        <w:t xml:space="preserve">  </w:t>
+      </w:r>
+      <w:r>
+        <w:rPr>
+          <w:sz w:val="24"/>
+          <w:szCs w:val="24"/>
+          <w:lang w:val="en-US"/>
+        </w:rPr>
+        <w:sym w:font="Wingdings" w:char="F0E0"/>
+      </w:r>
+      <w:r>
+        <w:rPr>
+          <w:sz w:val="24"/>
+          <w:szCs w:val="24"/>
+          <w:lang w:val="en-US"/>
+        </w:rPr>
+        <w:t>Cells to add</w:t>
+      </w:r>
+    </w:p>
+    <w:p>
+      <w:pPr>
+        <w:pStyle w:val="ListParagraph"/>
+        <w:numPr>
+          <w:ilvl w:val="2"/>
+          <w:numId w:val="2"/>
+        </w:numPr>
+        <w:rPr>
+          <w:sz w:val="24"/>
+          <w:szCs w:val="24"/>
+          <w:lang w:val="en-US"/>
+        </w:rPr>
+      </w:pPr>
+      <w:r>
+        <w:rPr>
+          <w:sz w:val="24"/>
+          <w:szCs w:val="24"/>
+          <w:lang w:val="en-US"/>
+        </w:rPr>
+        <w:t>criteria</w:t>
+      </w:r>
+      <w:r>
+        <w:rPr>
+          <w:sz w:val="24"/>
+          <w:szCs w:val="24"/>
+          <w:lang w:val="en-US"/>
+        </w:rPr>
+        <w:t xml:space="preserve">_range1  </w:t>
+      </w:r>
+      <w:r>
+        <w:rPr>
+          <w:sz w:val="24"/>
+          <w:szCs w:val="24"/>
+          <w:lang w:val="en-US"/>
+        </w:rPr>
+        <w:sym w:font="Wingdings" w:char="F0E0"/>
+      </w:r>
+      <w:r>
+        <w:rPr>
+          <w:sz w:val="24"/>
+          <w:szCs w:val="24"/>
+          <w:lang w:val="en-US"/>
+        </w:rPr>
+        <w:t xml:space="preserve"> First range to check</w:t>
+      </w:r>
+    </w:p>
+    <w:p>
+      <w:pPr>
+        <w:pStyle w:val="ListParagraph"/>
+        <w:numPr>
+          <w:ilvl w:val="2"/>
+          <w:numId w:val="2"/>
+        </w:numPr>
+        <w:rPr>
+          <w:sz w:val="24"/>
+          <w:szCs w:val="24"/>
+          <w:lang w:val="en-US"/>
+        </w:rPr>
+      </w:pPr>
+      <w:r>
+        <w:rPr>
+          <w:sz w:val="24"/>
+          <w:szCs w:val="24"/>
+          <w:lang w:val="en-US"/>
+        </w:rPr>
+        <w:t xml:space="preserve">criteria1  </w:t>
+      </w:r>
+      <w:r>
+        <w:rPr>
+          <w:sz w:val="24"/>
+          <w:szCs w:val="24"/>
+          <w:lang w:val="en-US"/>
+        </w:rPr>
+        <w:sym w:font="Wingdings" w:char="F0E0"/>
+      </w:r>
+      <w:r>
+        <w:rPr>
+          <w:sz w:val="24"/>
+          <w:szCs w:val="24"/>
+          <w:lang w:val="en-US"/>
+        </w:rPr>
+        <w:t xml:space="preserve"> First condition</w:t>
+      </w:r>
+    </w:p>
+    <w:p>
+      <w:pPr>
+        <w:pStyle w:val="ListParagraph"/>
+        <w:numPr>
+          <w:ilvl w:val="2"/>
+          <w:numId w:val="2"/>
+        </w:numPr>
+        <w:rPr>
+          <w:sz w:val="24"/>
+          <w:szCs w:val="24"/>
+          <w:lang w:val="en-US"/>
+        </w:rPr>
+      </w:pPr>
+      <w:r>
+        <w:rPr>
+          <w:sz w:val="24"/>
+          <w:szCs w:val="24"/>
+          <w:lang w:val="en-US"/>
+        </w:rPr>
+        <w:t>criteria</w:t>
+      </w:r>
+      <w:r>
+        <w:rPr>
+          <w:sz w:val="24"/>
+          <w:szCs w:val="24"/>
+          <w:lang w:val="en-US"/>
+        </w:rPr>
+        <w:t xml:space="preserve">_range2  </w:t>
+      </w:r>
+      <w:r>
+        <w:rPr>
+          <w:sz w:val="24"/>
+          <w:szCs w:val="24"/>
+          <w:lang w:val="en-US"/>
+        </w:rPr>
+        <w:sym w:font="Wingdings" w:char="F0E0"/>
+      </w:r>
+      <w:r>
+        <w:rPr>
+          <w:sz w:val="24"/>
+          <w:szCs w:val="24"/>
+          <w:lang w:val="en-US"/>
+        </w:rPr>
+        <w:t xml:space="preserve"> Second range to check</w:t>
+      </w:r>
+    </w:p>
+    <w:p>
+      <w:pPr>
+        <w:pStyle w:val="ListParagraph"/>
+        <w:numPr>
+          <w:ilvl w:val="2"/>
+          <w:numId w:val="2"/>
+        </w:numPr>
+        <w:rPr>
+          <w:sz w:val="24"/>
+          <w:szCs w:val="24"/>
+          <w:lang w:val="en-US"/>
+        </w:rPr>
+      </w:pPr>
+      <w:r>
+        <w:rPr>
+          <w:sz w:val="24"/>
+          <w:szCs w:val="24"/>
+          <w:lang w:val="en-US"/>
+        </w:rPr>
+        <w:t xml:space="preserve">criteria2  </w:t>
+      </w:r>
+      <w:r>
+        <w:rPr>
+          <w:sz w:val="24"/>
+          <w:szCs w:val="24"/>
+          <w:lang w:val="en-US"/>
+        </w:rPr>
+        <w:sym w:font="Wingdings" w:char="F0E0"/>
+      </w:r>
+      <w:r>
+        <w:rPr>
+          <w:sz w:val="24"/>
+          <w:szCs w:val="24"/>
+          <w:lang w:val="en-US"/>
+        </w:rPr>
+        <w:t xml:space="preserve"> Second condition</w:t>
+      </w:r>
+    </w:p>
+    <w:p>
+      <w:pPr>
+        <w:rPr>
+          <w:sz w:val="24"/>
+          <w:szCs w:val="24"/>
+          <w:lang w:val="en-US"/>
+        </w:rPr>
+      </w:pPr>
+      <w:r>
+        <w:rPr>
+          <w:sz w:val="24"/>
+          <w:szCs w:val="24"/>
+          <w:lang w:val="en-US"/>
+        </w:rPr>
+        <w:drawing>
+          <wp:inline distT="0" distB="0" distL="0" distR="0" wp14:anchorId="421A0B26" wp14:editId="0AC1CA31">
+            <wp:extent cx="5730756" cy="3132814"/>
+            <wp:effectExtent l="0" t="0" r="3810" b="0"/>
+            <wp:docPr id="3" name="Picture 3"/>
+            <wp:cNvGraphicFramePr>
+              <a:graphicFrameLocks xmlns:a="http://schemas.openxmlformats.org/drawingml/2006/main" noChangeAspect="1"/>
+            </wp:cNvGraphicFramePr>
+            <a:graphic xmlns:a="http://schemas.openxmlformats.org/drawingml/2006/main">
+              <a:graphicData uri="http://schemas.openxmlformats.org/drawingml/2006/picture">
+                <pic:pic xmlns:pic="http://schemas.openxmlformats.org/drawingml/2006/picture">
+                  <pic:nvPicPr>
+                    <pic:cNvPr id="1" name=""/>
+                    <pic:cNvPicPr/>
+                  </pic:nvPicPr>
+                  <pic:blipFill>
+                    <a:blip r:embed="rId7"/>
+                    <a:stretch>
+                      <a:fillRect/>
+                    </a:stretch>
+                  </pic:blipFill>
+                  <pic:spPr>
+                    <a:xfrm>
+                      <a:off x="0" y="0"/>
+                      <a:ext cx="5743264" cy="3139652"/>
+                    </a:xfrm>
+                    <a:prstGeom prst="rect">
+                      <a:avLst/>
+                    </a:prstGeom>
+                  </pic:spPr>
+                </pic:pic>
+              </a:graphicData>
+            </a:graphic>
+          </wp:inline>
+        </w:drawing>
+      </w:r>
+    </w:p>
+    <w:p>
+      <w:pPr>
+        <w:pStyle w:val="ListParagraph"/>
+        <w:numPr>
+          <w:ilvl w:val="0"/>
+          <w:numId w:val="2"/>
+        </w:numPr>
+        <w:rPr>
+          <w:sz w:val="24"/>
+          <w:szCs w:val="24"/>
+          <w:lang w:val="en-US"/>
+        </w:rPr>
+      </w:pPr>
+      <w:proofErr w:type="gramStart"/>
+      <w:r>
+        <w:rPr>
+          <w:sz w:val="24"/>
+          <w:szCs w:val="24"/>
+          <w:lang w:val="en-US"/>
+        </w:rPr>
+        <w:t>SUMPRODUCT</w:t>
+      </w:r>
+      <w:r>
+        <w:rPr>
+          <w:sz w:val="24"/>
+          <w:szCs w:val="24"/>
+          <w:lang w:val="en-US"/>
+        </w:rPr>
+        <w:t>(</w:t>
+      </w:r>
+      <w:proofErr w:type="gramEnd"/>
+      <w:r>
+        <w:rPr>
+          <w:sz w:val="24"/>
+          <w:szCs w:val="24"/>
+          <w:lang w:val="en-US"/>
+        </w:rPr>
+        <w:t>array1, array2)</w:t>
+      </w:r>
+      <w:r>
+        <w:rPr>
+          <w:sz w:val="24"/>
+          <w:szCs w:val="24"/>
+          <w:lang w:val="en-US"/>
+        </w:rPr>
+        <w:tab/>
+      </w:r>
+      <w:r>
+        <w:rPr>
+          <w:sz w:val="24"/>
+          <w:szCs w:val="24"/>
+          <w:lang w:val="en-US"/>
+        </w:rPr>
+        <w:sym w:font="Wingdings" w:char="F0E0"/>
+      </w:r>
+      <w:r>
+        <w:rPr>
+          <w:sz w:val="24"/>
+          <w:szCs w:val="24"/>
+          <w:lang w:val="en-US"/>
+        </w:rPr>
+        <w:t xml:space="preserve"> it multiplies corresponding values in two or more ranges and then adds the results.</w:t>
+      </w:r>
+      <w:r>
+        <w:rPr>
+          <w:sz w:val="24"/>
+          <w:szCs w:val="24"/>
+          <w:lang w:val="en-US"/>
+        </w:rPr>
+        <w:tab/>
+        <w:t xml:space="preserve">      </w:t>
+      </w:r>
+    </w:p>
+    <w:p>
+      <w:pPr>
+        <w:jc w:val="both"/>
+        <w:rPr>
+          <w:sz w:val="24"/>
+          <w:szCs w:val="24"/>
+          <w:lang w:val="en-US"/>
+        </w:rPr>
+      </w:pPr>
+      <w:r>
+        <w:rPr>
+          <w:sz w:val="24"/>
+          <w:szCs w:val="24"/>
+          <w:lang w:val="en-US"/>
+        </w:rPr>
+        <w:drawing>
+          <wp:inline distT="0" distB="0" distL="0" distR="0" wp14:anchorId="67598A4F" wp14:editId="711BF647">
+            <wp:extent cx="5730832" cy="3450866"/>
+            <wp:effectExtent l="0" t="0" r="3810" b="0"/>
+            <wp:docPr id="4" name="Picture 4"/>
+            <wp:cNvGraphicFramePr>
+              <a:graphicFrameLocks xmlns:a="http://schemas.openxmlformats.org/drawingml/2006/main" noChangeAspect="1"/>
+            </wp:cNvGraphicFramePr>
+            <a:graphic xmlns:a="http://schemas.openxmlformats.org/drawingml/2006/main">
+              <a:graphicData uri="http://schemas.openxmlformats.org/drawingml/2006/picture">
+                <pic:pic xmlns:pic="http://schemas.openxmlformats.org/drawingml/2006/picture">
+                  <pic:nvPicPr>
+                    <pic:cNvPr id="1" name=""/>
+                    <pic:cNvPicPr/>
+                  </pic:nvPicPr>
+                  <pic:blipFill>
+                    <a:blip r:embed="rId8"/>
+                    <a:stretch>
+                      <a:fillRect/>
+                    </a:stretch>
+                  </pic:blipFill>
+                  <pic:spPr>
+                    <a:xfrm>
+                      <a:off x="0" y="0"/>
+                      <a:ext cx="5740382" cy="3456617"/>
+                    </a:xfrm>
+                    <a:prstGeom prst="rect">
+                      <a:avLst/>
+                    </a:prstGeom>
+                  </pic:spPr>
+                </pic:pic>
+              </a:graphicData>
+            </a:graphic>
+          </wp:inline>
+        </w:drawing>
+      </w:r>
+    </w:p>
+    <w:p>
+      <w:pPr>
+        <w:pStyle w:val="ListParagraph"/>
+        <w:numPr>
+          <w:ilvl w:val="0"/>
+          <w:numId w:val="2"/>
+        </w:numPr>
+        <w:jc w:val="both"/>
+        <w:rPr>
+          <w:sz w:val="24"/>
+          <w:szCs w:val="24"/>
+          <w:lang w:val="en-US"/>
+        </w:rPr>
+      </w:pPr>
+      <w:proofErr w:type="gramStart"/>
+      <w:r>
+        <w:rPr>
+          <w:sz w:val="24"/>
+          <w:szCs w:val="24"/>
+          <w:lang w:val="en-US"/>
+        </w:rPr>
+        <w:lastRenderedPageBreak/>
+        <w:t>INT(</w:t>
+      </w:r>
+      <w:proofErr w:type="gramEnd"/>
+      <w:r>
+        <w:rPr>
+          <w:sz w:val="24"/>
+          <w:szCs w:val="24"/>
+          <w:lang w:val="en-US"/>
+        </w:rPr>
+        <w:t>number)</w:t>
+      </w:r>
+      <w:r>
+        <w:rPr>
+          <w:sz w:val="24"/>
+          <w:szCs w:val="24"/>
+          <w:lang w:val="en-US"/>
+        </w:rPr>
+        <w:tab/>
+      </w:r>
+      <w:r>
+        <w:rPr>
+          <w:sz w:val="24"/>
+          <w:szCs w:val="24"/>
+          <w:lang w:val="en-US"/>
+        </w:rPr>
+        <w:tab/>
+      </w:r>
+      <w:r>
+        <w:rPr>
+          <w:sz w:val="24"/>
+          <w:szCs w:val="24"/>
+          <w:lang w:val="en-US"/>
+        </w:rPr>
+        <w:sym w:font="Wingdings" w:char="F0E0"/>
+      </w:r>
+      <w:r>
+        <w:rPr>
+          <w:sz w:val="24"/>
+          <w:szCs w:val="24"/>
+          <w:lang w:val="en-US"/>
+        </w:rPr>
+        <w:t xml:space="preserve"> it rounds a number down to the nearest integer(removes the decimal part)</w:t>
+      </w:r>
+      <w:r>
+        <w:rPr>
+          <w:sz w:val="24"/>
+          <w:szCs w:val="24"/>
+          <w:lang w:val="en-US"/>
+        </w:rPr>
+        <w:softHyphen/>
+      </w:r>
+    </w:p>
+    <w:p>
+      <w:pPr>
+        <w:jc w:val="both"/>
+        <w:rPr>
+          <w:sz w:val="24"/>
+          <w:szCs w:val="24"/>
+          <w:lang w:val="en-US"/>
+        </w:rPr>
+      </w:pPr>
+      <w:r>
+        <w:rPr>
+          <w:sz w:val="24"/>
+          <w:szCs w:val="24"/>
+          <w:lang w:val="en-US"/>
+        </w:rPr>
+        <w:drawing>
+          <wp:inline distT="0" distB="0" distL="0" distR="0" wp14:anchorId="386A25A6" wp14:editId="526E6B10">
+            <wp:extent cx="5731510" cy="3999506"/>
+            <wp:effectExtent l="0" t="0" r="2540" b="1270"/>
+            <wp:docPr id="6" name="Picture 6"/>
+            <wp:cNvGraphicFramePr>
+              <a:graphicFrameLocks xmlns:a="http://schemas.openxmlformats.org/drawingml/2006/main" noChangeAspect="1"/>
+            </wp:cNvGraphicFramePr>
+            <a:graphic xmlns:a="http://schemas.openxmlformats.org/drawingml/2006/main">
+              <a:graphicData uri="http://schemas.openxmlformats.org/drawingml/2006/picture">
+                <pic:pic xmlns:pic="http://schemas.openxmlformats.org/drawingml/2006/picture">
+                  <pic:nvPicPr>
+                    <pic:cNvPr id="1" name=""/>
+                    <pic:cNvPicPr/>
+                  </pic:nvPicPr>
+                  <pic:blipFill>
+                    <a:blip r:embed="rId9"/>
+                    <a:stretch>
+                      <a:fillRect/>
+                    </a:stretch>
+                  </pic:blipFill>
+                  <pic:spPr>
+                    <a:xfrm>
+                      <a:off x="0" y="0"/>
+                      <a:ext cx="5738220" cy="4004188"/>
+                    </a:xfrm>
+                    <a:prstGeom prst="rect">
+                      <a:avLst/>
+                    </a:prstGeom>
+                  </pic:spPr>
+                </pic:pic>
+              </a:graphicData>
+            </a:graphic>
+          </wp:inline>
+        </w:drawing>
+      </w:r>
+    </w:p>
+    <w:p>
+      <w:pPr>
+        <w:pStyle w:val="ListParagraph"/>
+        <w:numPr>
+          <w:ilvl w:val="0"/>
+          <w:numId w:val="2"/>
+        </w:numPr>
+        <w:jc w:val="both"/>
+        <w:rPr>
+          <w:sz w:val="24"/>
+          <w:szCs w:val="24"/>
+          <w:lang w:val="en-US"/>
+        </w:rPr>
+      </w:pPr>
+      <w:proofErr w:type="gramStart"/>
+      <w:r>
+        <w:rPr>
+          <w:sz w:val="24"/>
+          <w:szCs w:val="24"/>
+          <w:lang w:val="en-US"/>
+        </w:rPr>
+        <w:t>MOD(</w:t>
+      </w:r>
+      <w:proofErr w:type="gramEnd"/>
+      <w:r>
+        <w:rPr>
+          <w:sz w:val="24"/>
+          <w:szCs w:val="24"/>
+          <w:lang w:val="en-US"/>
+        </w:rPr>
+        <w:t>number, divisor)</w:t>
+      </w:r>
+      <w:r>
+        <w:rPr>
+          <w:sz w:val="24"/>
+          <w:szCs w:val="24"/>
+          <w:lang w:val="en-US"/>
+        </w:rPr>
+        <w:tab/>
+      </w:r>
+      <w:r>
+        <w:rPr>
+          <w:sz w:val="24"/>
+          <w:szCs w:val="24"/>
+          <w:lang w:val="en-US"/>
+        </w:rPr>
+        <w:sym w:font="Wingdings" w:char="F0E0"/>
+      </w:r>
+      <w:r>
+        <w:rPr>
+          <w:sz w:val="24"/>
+          <w:szCs w:val="24"/>
+          <w:lang w:val="en-US"/>
+        </w:rPr>
+        <w:t xml:space="preserve"> </w:t>
+      </w:r>
+      <w:r>
+        <w:rPr>
+          <w:sz w:val="24"/>
+          <w:szCs w:val="24"/>
+          <w:lang w:val="en-US"/>
+        </w:rPr>
+        <w:t xml:space="preserve"> it returns the remainder after dividing one number by another</w:t>
+      </w:r>
+    </w:p>
+    <w:p>
+      <w:pPr>
+        <w:jc w:val="both"/>
+        <w:rPr>
+          <w:sz w:val="24"/>
+          <w:szCs w:val="24"/>
+          <w:lang w:val="en-US"/>
+        </w:rPr>
+      </w:pPr>
+      <w:r>
+        <w:rPr>
+          <w:sz w:val="24"/>
+          <w:szCs w:val="24"/>
+          <w:lang w:val="en-US"/>
+        </w:rPr>
+        <w:drawing>
+          <wp:inline distT="0" distB="0" distL="0" distR="0" wp14:anchorId="6F08747B" wp14:editId="48C5AEC5">
+            <wp:extent cx="5731510" cy="3474720"/>
+            <wp:effectExtent l="0" t="0" r="2540" b="0"/>
+            <wp:docPr id="7" name="Picture 7"/>
+            <wp:cNvGraphicFramePr>
+              <a:graphicFrameLocks xmlns:a="http://schemas.openxmlformats.org/drawingml/2006/main" noChangeAspect="1"/>
+            </wp:cNvGraphicFramePr>
+            <a:graphic xmlns:a="http://schemas.openxmlformats.org/drawingml/2006/main">
+              <a:graphicData uri="http://schemas.openxmlformats.org/drawingml/2006/picture">
+                <pic:pic xmlns:pic="http://schemas.openxmlformats.org/drawingml/2006/picture">
+                  <pic:nvPicPr>
+                    <pic:cNvPr id="1" name=""/>
+                    <pic:cNvPicPr/>
+                  </pic:nvPicPr>
+                  <pic:blipFill>
+                    <a:blip r:embed="rId10"/>
+                    <a:stretch>
+                      <a:fillRect/>
+                    </a:stretch>
+                  </pic:blipFill>
+                  <pic:spPr>
+                    <a:xfrm>
+                      <a:off x="0" y="0"/>
+                      <a:ext cx="5733438" cy="3475889"/>
+                    </a:xfrm>
+                    <a:prstGeom prst="rect">
+                      <a:avLst/>
+                    </a:prstGeom>
+                  </pic:spPr>
+                </pic:pic>
+              </a:graphicData>
+            </a:graphic>
+          </wp:inline>
+        </w:drawing>
+      </w:r>
+    </w:p>
+    <w:p>
+      <w:pPr>
+        <w:pStyle w:val="ListParagraph"/>
+        <w:numPr>
+          <w:ilvl w:val="0"/>
+          <w:numId w:val="2"/>
+        </w:numPr>
+        <w:jc w:val="both"/>
+        <w:rPr>
+          <w:sz w:val="24"/>
+          <w:szCs w:val="24"/>
+          <w:lang w:val="en-US"/>
+        </w:rPr>
+      </w:pPr>
+      <w:proofErr w:type="gramStart"/>
+      <w:r>
+        <w:rPr>
+          <w:sz w:val="24"/>
+          <w:szCs w:val="24"/>
+          <w:lang w:val="en-US"/>
+        </w:rPr>
+        <w:lastRenderedPageBreak/>
+        <w:t>ROUND(</w:t>
+      </w:r>
+      <w:proofErr w:type="gramEnd"/>
+      <w:r>
+        <w:rPr>
+          <w:sz w:val="24"/>
+          <w:szCs w:val="24"/>
+          <w:lang w:val="en-US"/>
+        </w:rPr>
+        <w:t>number, num_digits)</w:t>
+      </w:r>
+      <w:r>
+        <w:rPr>
+          <w:sz w:val="24"/>
+          <w:szCs w:val="24"/>
+          <w:lang w:val="en-US"/>
+        </w:rPr>
+        <w:tab/>
+      </w:r>
+      <w:r>
+        <w:rPr>
+          <w:sz w:val="24"/>
+          <w:szCs w:val="24"/>
+          <w:lang w:val="en-US"/>
+        </w:rPr>
+        <w:tab/>
+      </w:r>
+      <w:r>
+        <w:rPr>
+          <w:sz w:val="24"/>
+          <w:szCs w:val="24"/>
+          <w:lang w:val="en-US"/>
+        </w:rPr>
+        <w:sym w:font="Wingdings" w:char="F0E0"/>
+      </w:r>
+      <w:r>
+        <w:rPr>
+          <w:sz w:val="24"/>
+          <w:szCs w:val="24"/>
+          <w:lang w:val="en-US"/>
+        </w:rPr>
+        <w:t xml:space="preserve"> it rounds a number to specified numb</w:t>
+      </w:r>
+      <w:r>
+        <w:rPr>
+          <w:sz w:val="24"/>
+          <w:szCs w:val="24"/>
+          <w:lang w:val="en-US"/>
+        </w:rPr>
+        <w:t>e</w:t>
+      </w:r>
+      <w:r>
+        <w:rPr>
+          <w:sz w:val="24"/>
+          <w:szCs w:val="24"/>
+          <w:lang w:val="en-US"/>
+        </w:rPr>
+        <w:t>r of decimal places.</w:t>
+      </w:r>
+      <w:r>
+        <w:rPr>
+          <w:sz w:val="24"/>
+          <w:szCs w:val="24"/>
+          <w:lang w:val="en-US"/>
+        </w:rPr>
+        <w:softHyphen/>
+      </w:r>
+    </w:p>
+    <w:p>
+      <w:pPr>
+        <w:jc w:val="both"/>
+        <w:rPr>
+          <w:sz w:val="24"/>
+          <w:szCs w:val="24"/>
+          <w:lang w:val="en-US"/>
+        </w:rPr>
+      </w:pPr>
+      <w:r>
+        <w:rPr>
+          <w:sz w:val="24"/>
+          <w:szCs w:val="24"/>
+          <w:lang w:val="en-US"/>
+        </w:rPr>
+        <w:drawing>
+          <wp:inline distT="0" distB="0" distL="0" distR="0" wp14:anchorId="0B85E522" wp14:editId="057CD23C">
+            <wp:extent cx="5731510" cy="4436828"/>
+            <wp:effectExtent l="0" t="0" r="2540" b="1905"/>
+            <wp:docPr id="8" name="Picture 8"/>
+            <wp:cNvGraphicFramePr>
+              <a:graphicFrameLocks xmlns:a="http://schemas.openxmlformats.org/drawingml/2006/main" noChangeAspect="1"/>
+            </wp:cNvGraphicFramePr>
+            <a:graphic xmlns:a="http://schemas.openxmlformats.org/drawingml/2006/main">
+              <a:graphicData uri="http://schemas.openxmlformats.org/drawingml/2006/picture">
+                <pic:pic xmlns:pic="http://schemas.openxmlformats.org/drawingml/2006/picture">
+                  <pic:nvPicPr>
+                    <pic:cNvPr id="1" name=""/>
+                    <pic:cNvPicPr/>
+                  </pic:nvPicPr>
+                  <pic:blipFill>
+                    <a:blip r:embed="rId11"/>
+                    <a:stretch>
+                      <a:fillRect/>
+                    </a:stretch>
+                  </pic:blipFill>
+                  <pic:spPr>
+                    <a:xfrm>
+                      <a:off x="0" y="0"/>
+                      <a:ext cx="5738665" cy="4442367"/>
+                    </a:xfrm>
+                    <a:prstGeom prst="rect">
+                      <a:avLst/>
+                    </a:prstGeom>
+                  </pic:spPr>
+                </pic:pic>
+              </a:graphicData>
+            </a:graphic>
+          </wp:inline>
+        </w:drawing>
+      </w:r>
+    </w:p>
+    <w:p>
+      <w:pPr>
+        <w:pStyle w:val="ListParagraph"/>
+        <w:numPr>
+          <w:ilvl w:val="0"/>
+          <w:numId w:val="2"/>
+        </w:numPr>
+        <w:jc w:val="both"/>
+        <w:rPr>
+          <w:sz w:val="24"/>
+          <w:szCs w:val="24"/>
+          <w:lang w:val="en-US"/>
+        </w:rPr>
+      </w:pPr>
+      <w:proofErr w:type="gramStart"/>
+      <w:r>
+        <w:rPr>
+          <w:sz w:val="24"/>
+          <w:szCs w:val="24"/>
+          <w:lang w:val="en-US"/>
+        </w:rPr>
+        <w:t>SQRT(</w:t>
+      </w:r>
+      <w:proofErr w:type="gramEnd"/>
+      <w:r>
+        <w:rPr>
+          <w:sz w:val="24"/>
+          <w:szCs w:val="24"/>
+          <w:lang w:val="en-US"/>
+        </w:rPr>
+        <w:t>number)</w:t>
+      </w:r>
+      <w:r>
+        <w:rPr>
+          <w:sz w:val="24"/>
+          <w:szCs w:val="24"/>
+          <w:lang w:val="en-US"/>
+        </w:rPr>
+        <w:tab/>
+      </w:r>
+      <w:r>
+        <w:rPr>
+          <w:sz w:val="24"/>
+          <w:szCs w:val="24"/>
+          <w:lang w:val="en-US"/>
+        </w:rPr>
+        <w:tab/>
+      </w:r>
+      <w:r>
+        <w:rPr>
+          <w:sz w:val="24"/>
+          <w:szCs w:val="24"/>
+          <w:lang w:val="en-US"/>
+        </w:rPr>
+        <w:sym w:font="Wingdings" w:char="F0E0"/>
+      </w:r>
+      <w:r>
+        <w:rPr>
+          <w:sz w:val="24"/>
+          <w:szCs w:val="24"/>
+          <w:lang w:val="en-US"/>
+        </w:rPr>
+        <w:t xml:space="preserve"> it returns the square root of number.</w:t>
+      </w:r>
+    </w:p>
+    <w:p>
+      <w:pPr>
+        <w:jc w:val="both"/>
+        <w:rPr>
+          <w:sz w:val="24"/>
+          <w:szCs w:val="24"/>
+          <w:lang w:val="en-US"/>
+        </w:rPr>
+      </w:pPr>
+      <w:r>
+        <w:rPr>
+          <w:sz w:val="24"/>
+          <w:szCs w:val="24"/>
+          <w:lang w:val="en-US"/>
+        </w:rPr>
+        <w:drawing>
+          <wp:inline distT="0" distB="0" distL="0" distR="0" wp14:anchorId="6C9A83DC" wp14:editId="17AF2BB8">
+            <wp:extent cx="5731510" cy="3450866"/>
+            <wp:effectExtent l="0" t="0" r="2540" b="0"/>
+            <wp:docPr id="9" name="Picture 9"/>
+            <wp:cNvGraphicFramePr>
+              <a:graphicFrameLocks xmlns:a="http://schemas.openxmlformats.org/drawingml/2006/main" noChangeAspect="1"/>
+            </wp:cNvGraphicFramePr>
+            <a:graphic xmlns:a="http://schemas.openxmlformats.org/drawingml/2006/main">
+              <a:graphicData uri="http://schemas.openxmlformats.org/drawingml/2006/picture">
+                <pic:pic xmlns:pic="http://schemas.openxmlformats.org/drawingml/2006/picture">
+                  <pic:nvPicPr>
+                    <pic:cNvPr id="1" name=""/>
+                    <pic:cNvPicPr/>
+                  </pic:nvPicPr>
+                  <pic:blipFill>
+                    <a:blip r:embed="rId12"/>
+                    <a:stretch>
+                      <a:fillRect/>
+                    </a:stretch>
+                  </pic:blipFill>
+                  <pic:spPr>
+                    <a:xfrm>
+                      <a:off x="0" y="0"/>
+                      <a:ext cx="5740838" cy="3456482"/>
+                    </a:xfrm>
+                    <a:prstGeom prst="rect">
+                      <a:avLst/>
+                    </a:prstGeom>
+                  </pic:spPr>
+                </pic:pic>
+              </a:graphicData>
+            </a:graphic>
+          </wp:inline>
+        </w:drawing>
+      </w:r>
+    </w:p>
     <w:sectPr>
       <w:pgSz w:w="11906" w:h="16838"/>
       <w:pgMar w:top="1440" w:right="1440" w:bottom="1440" w:left="1440" w:header="708" w:footer="708" w:gutter="0"/>
@@ -1811,7 +2922,7 @@
     </w:lvl>
   </w:abstractNum>
   <w:abstractNum w:abstractNumId="2" w15:restartNumberingAfterBreak="0">
-    <w:nsid w:val="793D5B17"/>
+    <w:nsid w:val="5BFC2536"/>
     <w:multiLevelType w:val="hybridMultilevel"/>
     <w:tmpl w:val="9E0836A4"/>
     <w:lvl w:ilvl="0" w:tplc="4009000F">
@@ -1899,14 +3010,106 @@
       </w:pPr>
     </w:lvl>
   </w:abstractNum>
+  <w:abstractNum w:abstractNumId="3" w15:restartNumberingAfterBreak="0">
+    <w:nsid w:val="793D5B17"/>
+    <w:multiLevelType w:val="hybridMultilevel"/>
+    <w:tmpl w:val="9E0836A4"/>
+    <w:lvl w:ilvl="0" w:tplc="4009000F">
+      <w:start w:val="1"/>
+      <w:numFmt w:val="decimal"/>
+      <w:lvlText w:val="%1."/>
+      <w:lvlJc w:val="left"/>
+      <w:pPr>
+        <w:ind w:left="720" w:hanging="360"/>
+      </w:pPr>
+      <w:rPr>
+        <w:rFonts w:hint="default"/>
+      </w:rPr>
+    </w:lvl>
+    <w:lvl w:ilvl="1" w:tplc="40090019">
+      <w:start w:val="1"/>
+      <w:numFmt w:val="lowerLetter"/>
+      <w:lvlText w:val="%2."/>
+      <w:lvlJc w:val="left"/>
+      <w:pPr>
+        <w:ind w:left="1440" w:hanging="360"/>
+      </w:pPr>
+    </w:lvl>
+    <w:lvl w:ilvl="2" w:tplc="4009001B">
+      <w:start w:val="1"/>
+      <w:numFmt w:val="lowerRoman"/>
+      <w:lvlText w:val="%3."/>
+      <w:lvlJc w:val="right"/>
+      <w:pPr>
+        <w:ind w:left="2160" w:hanging="180"/>
+      </w:pPr>
+    </w:lvl>
+    <w:lvl w:ilvl="3" w:tplc="4009000F">
+      <w:start w:val="1"/>
+      <w:numFmt w:val="decimal"/>
+      <w:lvlText w:val="%4."/>
+      <w:lvlJc w:val="left"/>
+      <w:pPr>
+        <w:ind w:left="2880" w:hanging="360"/>
+      </w:pPr>
+    </w:lvl>
+    <w:lvl w:ilvl="4" w:tplc="40090019">
+      <w:start w:val="1"/>
+      <w:numFmt w:val="lowerLetter"/>
+      <w:lvlText w:val="%5."/>
+      <w:lvlJc w:val="left"/>
+      <w:pPr>
+        <w:ind w:left="3600" w:hanging="360"/>
+      </w:pPr>
+    </w:lvl>
+    <w:lvl w:ilvl="5" w:tplc="4009001B">
+      <w:start w:val="1"/>
+      <w:numFmt w:val="lowerRoman"/>
+      <w:lvlText w:val="%6."/>
+      <w:lvlJc w:val="right"/>
+      <w:pPr>
+        <w:ind w:left="4320" w:hanging="180"/>
+      </w:pPr>
+    </w:lvl>
+    <w:lvl w:ilvl="6" w:tplc="4009000F">
+      <w:start w:val="1"/>
+      <w:numFmt w:val="decimal"/>
+      <w:lvlText w:val="%7."/>
+      <w:lvlJc w:val="left"/>
+      <w:pPr>
+        <w:ind w:left="5040" w:hanging="360"/>
+      </w:pPr>
+    </w:lvl>
+    <w:lvl w:ilvl="7" w:tplc="40090019">
+      <w:start w:val="1"/>
+      <w:numFmt w:val="lowerLetter"/>
+      <w:lvlText w:val="%8."/>
+      <w:lvlJc w:val="left"/>
+      <w:pPr>
+        <w:ind w:left="5760" w:hanging="360"/>
+      </w:pPr>
+    </w:lvl>
+    <w:lvl w:ilvl="8" w:tplc="4009001B">
+      <w:start w:val="1"/>
+      <w:numFmt w:val="lowerRoman"/>
+      <w:lvlText w:val="%9."/>
+      <w:lvlJc w:val="right"/>
+      <w:pPr>
+        <w:ind w:left="6480" w:hanging="180"/>
+      </w:pPr>
+    </w:lvl>
+  </w:abstractNum>
   <w:num w:numId="1">
     <w:abstractNumId w:val="0"/>
   </w:num>
   <w:num w:numId="2">
-    <w:abstractNumId w:val="2"/>
+    <w:abstractNumId w:val="3"/>
   </w:num>
   <w:num w:numId="3">
     <w:abstractNumId w:val="1"/>
+  </w:num>
+  <w:num w:numId="4">
+    <w:abstractNumId w:val="2"/>
   </w:num>
 </w:numbering>
 </file>

</xml_diff>